<commit_message>
one-to-one mapping, many-to-one mapping in JPA/Hibernate
</commit_message>
<xml_diff>
--- a/01-spring-boot-overview/my notes.docx
+++ b/01-spring-boot-overview/my notes.docx
@@ -2213,7 +2213,13 @@
         <w:jc w:val="both"/>
       </w:pPr>
       <w:r>
-        <w:t xml:space="preserve">This will require username (“user”) and password (given after running app) </w:t>
+        <w:t xml:space="preserve">This will require </w:t>
+      </w:r>
+      <w:r>
+        <w:t xml:space="preserve">a </w:t>
+      </w:r>
+      <w:r>
+        <w:t xml:space="preserve">username (“user”) and password (given after running app) </w:t>
       </w:r>
       <w:proofErr w:type="gramStart"/>
       <w:r>
@@ -2432,6 +2438,342 @@
         </w:drawing>
       </w:r>
     </w:p>
+    <w:p>
+      <w:pPr>
+        <w:jc w:val="both"/>
+      </w:pPr>
+    </w:p>
+    <w:p>
+      <w:pPr>
+        <w:jc w:val="both"/>
+      </w:pPr>
+      <w:r>
+        <w:rPr>
+          <w:b/>
+          <w:bCs/>
+        </w:rPr>
+        <w:t>JDBC Authentication:</w:t>
+      </w:r>
+      <w:r>
+        <w:t xml:space="preserve"> </w:t>
+      </w:r>
+      <w:proofErr w:type="gramStart"/>
+      <w:r>
+        <w:t>users</w:t>
+      </w:r>
+      <w:proofErr w:type="gramEnd"/>
+      <w:r>
+        <w:t xml:space="preserve"> </w:t>
+      </w:r>
+      <w:r>
+        <w:t>data from database instead of hardcoded data</w:t>
+      </w:r>
+    </w:p>
+    <w:p>
+      <w:pPr>
+        <w:pStyle w:val="ListParagraph"/>
+        <w:numPr>
+          <w:ilvl w:val="0"/>
+          <w:numId w:val="4"/>
+        </w:numPr>
+        <w:jc w:val="both"/>
+      </w:pPr>
+      <w:r>
+        <w:t xml:space="preserve">Ensure database connection in </w:t>
+      </w:r>
+      <w:proofErr w:type="spellStart"/>
+      <w:r>
+        <w:t>application.properties</w:t>
+      </w:r>
+      <w:proofErr w:type="spellEnd"/>
+    </w:p>
+    <w:p>
+      <w:pPr>
+        <w:pStyle w:val="ListParagraph"/>
+        <w:ind w:left="1800"/>
+        <w:jc w:val="both"/>
+      </w:pPr>
+      <w:r>
+        <w:drawing>
+          <wp:inline distT="0" distB="0" distL="0" distR="0" wp14:anchorId="47F2D182" wp14:editId="495C339B">
+            <wp:extent cx="5302523" cy="1124008"/>
+            <wp:effectExtent l="0" t="0" r="0" b="0"/>
+            <wp:docPr id="1484470459" name="Picture 1"/>
+            <wp:cNvGraphicFramePr>
+              <a:graphicFrameLocks xmlns:a="http://schemas.openxmlformats.org/drawingml/2006/main" noChangeAspect="1"/>
+            </wp:cNvGraphicFramePr>
+            <a:graphic xmlns:a="http://schemas.openxmlformats.org/drawingml/2006/main">
+              <a:graphicData uri="http://schemas.openxmlformats.org/drawingml/2006/picture">
+                <pic:pic xmlns:pic="http://schemas.openxmlformats.org/drawingml/2006/picture">
+                  <pic:nvPicPr>
+                    <pic:cNvPr id="1484470459" name=""/>
+                    <pic:cNvPicPr/>
+                  </pic:nvPicPr>
+                  <pic:blipFill>
+                    <a:blip r:embed="rId14"/>
+                    <a:stretch>
+                      <a:fillRect/>
+                    </a:stretch>
+                  </pic:blipFill>
+                  <pic:spPr>
+                    <a:xfrm>
+                      <a:off x="0" y="0"/>
+                      <a:ext cx="5302523" cy="1124008"/>
+                    </a:xfrm>
+                    <a:prstGeom prst="rect">
+                      <a:avLst/>
+                    </a:prstGeom>
+                  </pic:spPr>
+                </pic:pic>
+              </a:graphicData>
+            </a:graphic>
+          </wp:inline>
+        </w:drawing>
+      </w:r>
+    </w:p>
+    <w:p>
+      <w:pPr>
+        <w:pStyle w:val="ListParagraph"/>
+        <w:numPr>
+          <w:ilvl w:val="0"/>
+          <w:numId w:val="4"/>
+        </w:numPr>
+        <w:jc w:val="both"/>
+      </w:pPr>
+      <w:r>
+        <w:t>Add support for JDBC in security configuration file</w:t>
+      </w:r>
+    </w:p>
+    <w:p>
+      <w:pPr>
+        <w:pStyle w:val="ListParagraph"/>
+        <w:ind w:left="1800"/>
+        <w:jc w:val="both"/>
+      </w:pPr>
+      <w:r>
+        <w:drawing>
+          <wp:inline distT="0" distB="0" distL="0" distR="0" wp14:anchorId="3DB4BF08" wp14:editId="6F59A2E9">
+            <wp:extent cx="5592726" cy="1543975"/>
+            <wp:effectExtent l="0" t="0" r="8255" b="0"/>
+            <wp:docPr id="1796319906" name="Picture 1"/>
+            <wp:cNvGraphicFramePr>
+              <a:graphicFrameLocks xmlns:a="http://schemas.openxmlformats.org/drawingml/2006/main" noChangeAspect="1"/>
+            </wp:cNvGraphicFramePr>
+            <a:graphic xmlns:a="http://schemas.openxmlformats.org/drawingml/2006/main">
+              <a:graphicData uri="http://schemas.openxmlformats.org/drawingml/2006/picture">
+                <pic:pic xmlns:pic="http://schemas.openxmlformats.org/drawingml/2006/picture">
+                  <pic:nvPicPr>
+                    <pic:cNvPr id="1796319906" name=""/>
+                    <pic:cNvPicPr/>
+                  </pic:nvPicPr>
+                  <pic:blipFill>
+                    <a:blip r:embed="rId15"/>
+                    <a:stretch>
+                      <a:fillRect/>
+                    </a:stretch>
+                  </pic:blipFill>
+                  <pic:spPr>
+                    <a:xfrm>
+                      <a:off x="0" y="0"/>
+                      <a:ext cx="5608011" cy="1548195"/>
+                    </a:xfrm>
+                    <a:prstGeom prst="rect">
+                      <a:avLst/>
+                    </a:prstGeom>
+                  </pic:spPr>
+                </pic:pic>
+              </a:graphicData>
+            </a:graphic>
+          </wp:inline>
+        </w:drawing>
+      </w:r>
+    </w:p>
+    <w:p>
+      <w:pPr>
+        <w:jc w:val="both"/>
+      </w:pPr>
+    </w:p>
+    <w:p>
+      <w:pPr>
+        <w:jc w:val="both"/>
+      </w:pPr>
+      <w:proofErr w:type="spellStart"/>
+      <w:r>
+        <w:rPr>
+          <w:b/>
+          <w:bCs/>
+        </w:rPr>
+        <w:lastRenderedPageBreak/>
+        <w:t>Bcrypt</w:t>
+      </w:r>
+      <w:proofErr w:type="spellEnd"/>
+      <w:r>
+        <w:rPr>
+          <w:b/>
+          <w:bCs/>
+        </w:rPr>
+        <w:t xml:space="preserve"> Encryption:</w:t>
+      </w:r>
+      <w:r>
+        <w:t xml:space="preserve"> encrypting passwords in database using the </w:t>
+      </w:r>
+      <w:proofErr w:type="spellStart"/>
+      <w:r>
+        <w:t>Bcrypt</w:t>
+      </w:r>
+      <w:proofErr w:type="spellEnd"/>
+      <w:r>
+        <w:t xml:space="preserve"> algorithm</w:t>
+      </w:r>
+    </w:p>
+    <w:p>
+      <w:pPr>
+        <w:jc w:val="both"/>
+      </w:pPr>
+      <w:r>
+        <w:tab/>
+      </w:r>
+      <w:r>
+        <w:drawing>
+          <wp:inline distT="0" distB="0" distL="0" distR="0" wp14:anchorId="3077A86B" wp14:editId="7984EC21">
+            <wp:extent cx="5740695" cy="1168460"/>
+            <wp:effectExtent l="0" t="0" r="0" b="0"/>
+            <wp:docPr id="396420130" name="Picture 1"/>
+            <wp:cNvGraphicFramePr>
+              <a:graphicFrameLocks xmlns:a="http://schemas.openxmlformats.org/drawingml/2006/main" noChangeAspect="1"/>
+            </wp:cNvGraphicFramePr>
+            <a:graphic xmlns:a="http://schemas.openxmlformats.org/drawingml/2006/main">
+              <a:graphicData uri="http://schemas.openxmlformats.org/drawingml/2006/picture">
+                <pic:pic xmlns:pic="http://schemas.openxmlformats.org/drawingml/2006/picture">
+                  <pic:nvPicPr>
+                    <pic:cNvPr id="396420130" name=""/>
+                    <pic:cNvPicPr/>
+                  </pic:nvPicPr>
+                  <pic:blipFill>
+                    <a:blip r:embed="rId16"/>
+                    <a:stretch>
+                      <a:fillRect/>
+                    </a:stretch>
+                  </pic:blipFill>
+                  <pic:spPr>
+                    <a:xfrm>
+                      <a:off x="0" y="0"/>
+                      <a:ext cx="5740695" cy="1168460"/>
+                    </a:xfrm>
+                    <a:prstGeom prst="rect">
+                      <a:avLst/>
+                    </a:prstGeom>
+                  </pic:spPr>
+                </pic:pic>
+              </a:graphicData>
+            </a:graphic>
+          </wp:inline>
+        </w:drawing>
+      </w:r>
+    </w:p>
+    <w:p>
+      <w:pPr>
+        <w:jc w:val="both"/>
+      </w:pPr>
+    </w:p>
+    <w:p>
+      <w:pPr>
+        <w:jc w:val="both"/>
+      </w:pPr>
+      <w:r>
+        <w:rPr>
+          <w:b/>
+          <w:bCs/>
+        </w:rPr>
+        <w:t>Custom Tables:</w:t>
+      </w:r>
+      <w:r>
+        <w:t xml:space="preserve"> use custom tables name instead of authorities and users</w:t>
+      </w:r>
+    </w:p>
+    <w:p>
+      <w:pPr>
+        <w:jc w:val="both"/>
+      </w:pPr>
+      <w:r>
+        <w:tab/>
+      </w:r>
+      <w:r>
+        <w:drawing>
+          <wp:inline distT="0" distB="0" distL="0" distR="0" wp14:anchorId="03168740" wp14:editId="5C3C46DC">
+            <wp:extent cx="5943600" cy="3348990"/>
+            <wp:effectExtent l="0" t="0" r="0" b="3810"/>
+            <wp:docPr id="1003006022" name="Picture 1"/>
+            <wp:cNvGraphicFramePr>
+              <a:graphicFrameLocks xmlns:a="http://schemas.openxmlformats.org/drawingml/2006/main" noChangeAspect="1"/>
+            </wp:cNvGraphicFramePr>
+            <a:graphic xmlns:a="http://schemas.openxmlformats.org/drawingml/2006/main">
+              <a:graphicData uri="http://schemas.openxmlformats.org/drawingml/2006/picture">
+                <pic:pic xmlns:pic="http://schemas.openxmlformats.org/drawingml/2006/picture">
+                  <pic:nvPicPr>
+                    <pic:cNvPr id="1003006022" name=""/>
+                    <pic:cNvPicPr/>
+                  </pic:nvPicPr>
+                  <pic:blipFill>
+                    <a:blip r:embed="rId17"/>
+                    <a:stretch>
+                      <a:fillRect/>
+                    </a:stretch>
+                  </pic:blipFill>
+                  <pic:spPr>
+                    <a:xfrm>
+                      <a:off x="0" y="0"/>
+                      <a:ext cx="5943600" cy="3348990"/>
+                    </a:xfrm>
+                    <a:prstGeom prst="rect">
+                      <a:avLst/>
+                    </a:prstGeom>
+                  </pic:spPr>
+                </pic:pic>
+              </a:graphicData>
+            </a:graphic>
+          </wp:inline>
+        </w:drawing>
+      </w:r>
+    </w:p>
+    <w:p/>
+    <w:p/>
+    <w:p/>
+    <w:p/>
+    <w:p>
+      <w:pPr>
+        <w:tabs>
+          <w:tab w:val="left" w:pos="5191"/>
+        </w:tabs>
+      </w:pPr>
+      <w:r>
+        <w:tab/>
+      </w:r>
+    </w:p>
+    <w:p>
+      <w:r>
+        <w:br w:type="page"/>
+      </w:r>
+    </w:p>
+    <w:p>
+      <w:pPr>
+        <w:tabs>
+          <w:tab w:val="left" w:pos="5191"/>
+        </w:tabs>
+        <w:jc w:val="center"/>
+      </w:pPr>
+      <w:r>
+        <w:lastRenderedPageBreak/>
+        <w:t>10.8.2026</w:t>
+      </w:r>
+    </w:p>
+    <w:p>
+      <w:pPr>
+        <w:tabs>
+          <w:tab w:val="left" w:pos="5191"/>
+        </w:tabs>
+      </w:pPr>
+    </w:p>
     <w:sectPr>
       <w:pgSz w:w="12240" w:h="15840"/>
       <w:pgMar w:top="1440" w:right="1440" w:bottom="1440" w:left="1440" w:header="720" w:footer="720" w:gutter="0"/>
@@ -2445,10 +2787,10 @@
 <file path=word/numbering.xml><?xml version="1.0" encoding="utf-8"?>
 <w:numbering xmlns:wpc="http://schemas.microsoft.com/office/word/2010/wordprocessingCanvas" xmlns:cx="http://schemas.microsoft.com/office/drawing/2014/chartex" xmlns:cx1="http://schemas.microsoft.com/office/drawing/2015/9/8/chartex" xmlns:cx2="http://schemas.microsoft.com/office/drawing/2015/10/21/chartex" xmlns:cx3="http://schemas.microsoft.com/office/drawing/2016/5/9/chartex" xmlns:cx4="http://schemas.microsoft.com/office/drawing/2016/5/10/chartex" xmlns:cx5="http://schemas.microsoft.com/office/drawing/2016/5/11/chartex" xmlns:cx6="http://schemas.microsoft.com/office/drawing/2016/5/12/chartex" xmlns:cx7="http://schemas.microsoft.com/office/drawing/2016/5/13/chartex" xmlns:cx8="http://schemas.microsoft.com/office/drawing/2016/5/14/chartex" xmlns:mc="http://schemas.openxmlformats.org/markup-compatibility/2006" xmlns:aink="http://schemas.microsoft.com/office/drawing/2016/ink" xmlns:am3d="http://schemas.microsoft.com/office/drawing/2017/model3d" xmlns:o="urn:schemas-microsoft-com:office:office" xmlns:oel="http://schemas.microsoft.com/office/2019/extlst" xmlns:r="http://schemas.openxmlformats.org/officeDocument/2006/relationships" xmlns:m="http://schemas.openxmlformats.org/officeDocument/2006/math" xmlns:v="urn:schemas-microsoft-com:vml" xmlns:wp14="http://schemas.microsoft.com/office/word/2010/wordprocessingDrawing" xmlns:wp="http://schemas.openxmlformats.org/drawingml/2006/wordprocessingDrawing" xmlns:w10="urn:schemas-microsoft-com:office:word" xmlns:w="http://schemas.openxmlformats.org/wordprocessingml/2006/main" xmlns:w14="http://schemas.microsoft.com/office/word/2010/wordml" xmlns:w15="http://schemas.microsoft.com/office/word/2012/wordml" xmlns:w16cei="http://schemas.microsoft.com/office/word/2026/wordml/cei" xmlns:w16cex="http://schemas.microsoft.com/office/word/2018/wordml/cex" xmlns:w16cid="http://schemas.microsoft.com/office/word/2016/wordml/cid" xmlns:w16="http://schemas.microsoft.com/office/word/2018/wordml" xmlns:w16du="http://schemas.microsoft.com/office/word/2023/wordml/word16du" xmlns:w16sdtdh="http://schemas.microsoft.com/office/word/2020/wordml/sdtdatahash" xmlns:w16sdtfl="http://schemas.microsoft.com/office/word/2024/wordml/sdtformatlock" xmlns:w16se="http://schemas.microsoft.com/office/word/2015/wordml/symex" xmlns:wpg="http://schemas.microsoft.com/office/word/2010/wordprocessingGroup" xmlns:wpi="http://schemas.microsoft.com/office/word/2010/wordprocessingInk" xmlns:wne="http://schemas.microsoft.com/office/word/2006/wordml" xmlns:wps="http://schemas.microsoft.com/office/word/2010/wordprocessingShape" mc:Ignorable="w14 w15 w16se w16cid w16 w16cex w16sdtdh w16sdtfl w16du wp14">
   <w:abstractNum w:abstractNumId="0" w15:restartNumberingAfterBreak="0">
-    <w:nsid w:val="59DF1A17"/>
+    <w:nsid w:val="0EF45747"/>
     <w:multiLevelType w:val="hybridMultilevel"/>
-    <w:tmpl w:val="ECD066EE"/>
-    <w:lvl w:ilvl="0" w:tplc="C6F8C722">
+    <w:tmpl w:val="26F031A0"/>
+    <w:lvl w:ilvl="0" w:tplc="96223DAA">
       <w:start w:val="1"/>
       <w:numFmt w:val="decimal"/>
       <w:lvlText w:val="%1."/>
@@ -2534,10 +2876,10 @@
     </w:lvl>
   </w:abstractNum>
   <w:abstractNum w:abstractNumId="1" w15:restartNumberingAfterBreak="0">
-    <w:nsid w:val="5F27144B"/>
+    <w:nsid w:val="59DF1A17"/>
     <w:multiLevelType w:val="hybridMultilevel"/>
-    <w:tmpl w:val="32D2FE66"/>
-    <w:lvl w:ilvl="0" w:tplc="3D08D774">
+    <w:tmpl w:val="ECD066EE"/>
+    <w:lvl w:ilvl="0" w:tplc="C6F8C722">
       <w:start w:val="1"/>
       <w:numFmt w:val="decimal"/>
       <w:lvlText w:val="%1."/>
@@ -2623,10 +2965,10 @@
     </w:lvl>
   </w:abstractNum>
   <w:abstractNum w:abstractNumId="2" w15:restartNumberingAfterBreak="0">
-    <w:nsid w:val="6FB40EE1"/>
+    <w:nsid w:val="5F27144B"/>
     <w:multiLevelType w:val="hybridMultilevel"/>
-    <w:tmpl w:val="B426C228"/>
-    <w:lvl w:ilvl="0" w:tplc="C3288A14">
+    <w:tmpl w:val="32D2FE66"/>
+    <w:lvl w:ilvl="0" w:tplc="3D08D774">
       <w:start w:val="1"/>
       <w:numFmt w:val="decimal"/>
       <w:lvlText w:val="%1."/>
@@ -2711,14 +3053,106 @@
       </w:pPr>
     </w:lvl>
   </w:abstractNum>
+  <w:abstractNum w:abstractNumId="3" w15:restartNumberingAfterBreak="0">
+    <w:nsid w:val="6FB40EE1"/>
+    <w:multiLevelType w:val="hybridMultilevel"/>
+    <w:tmpl w:val="B426C228"/>
+    <w:lvl w:ilvl="0" w:tplc="C3288A14">
+      <w:start w:val="1"/>
+      <w:numFmt w:val="decimal"/>
+      <w:lvlText w:val="%1."/>
+      <w:lvlJc w:val="left"/>
+      <w:pPr>
+        <w:ind w:left="1800" w:hanging="360"/>
+      </w:pPr>
+      <w:rPr>
+        <w:rFonts w:hint="default"/>
+      </w:rPr>
+    </w:lvl>
+    <w:lvl w:ilvl="1" w:tplc="04090019" w:tentative="1">
+      <w:start w:val="1"/>
+      <w:numFmt w:val="lowerLetter"/>
+      <w:lvlText w:val="%2."/>
+      <w:lvlJc w:val="left"/>
+      <w:pPr>
+        <w:ind w:left="2520" w:hanging="360"/>
+      </w:pPr>
+    </w:lvl>
+    <w:lvl w:ilvl="2" w:tplc="0409001B" w:tentative="1">
+      <w:start w:val="1"/>
+      <w:numFmt w:val="lowerRoman"/>
+      <w:lvlText w:val="%3."/>
+      <w:lvlJc w:val="right"/>
+      <w:pPr>
+        <w:ind w:left="3240" w:hanging="180"/>
+      </w:pPr>
+    </w:lvl>
+    <w:lvl w:ilvl="3" w:tplc="0409000F" w:tentative="1">
+      <w:start w:val="1"/>
+      <w:numFmt w:val="decimal"/>
+      <w:lvlText w:val="%4."/>
+      <w:lvlJc w:val="left"/>
+      <w:pPr>
+        <w:ind w:left="3960" w:hanging="360"/>
+      </w:pPr>
+    </w:lvl>
+    <w:lvl w:ilvl="4" w:tplc="04090019" w:tentative="1">
+      <w:start w:val="1"/>
+      <w:numFmt w:val="lowerLetter"/>
+      <w:lvlText w:val="%5."/>
+      <w:lvlJc w:val="left"/>
+      <w:pPr>
+        <w:ind w:left="4680" w:hanging="360"/>
+      </w:pPr>
+    </w:lvl>
+    <w:lvl w:ilvl="5" w:tplc="0409001B" w:tentative="1">
+      <w:start w:val="1"/>
+      <w:numFmt w:val="lowerRoman"/>
+      <w:lvlText w:val="%6."/>
+      <w:lvlJc w:val="right"/>
+      <w:pPr>
+        <w:ind w:left="5400" w:hanging="180"/>
+      </w:pPr>
+    </w:lvl>
+    <w:lvl w:ilvl="6" w:tplc="0409000F" w:tentative="1">
+      <w:start w:val="1"/>
+      <w:numFmt w:val="decimal"/>
+      <w:lvlText w:val="%7."/>
+      <w:lvlJc w:val="left"/>
+      <w:pPr>
+        <w:ind w:left="6120" w:hanging="360"/>
+      </w:pPr>
+    </w:lvl>
+    <w:lvl w:ilvl="7" w:tplc="04090019" w:tentative="1">
+      <w:start w:val="1"/>
+      <w:numFmt w:val="lowerLetter"/>
+      <w:lvlText w:val="%8."/>
+      <w:lvlJc w:val="left"/>
+      <w:pPr>
+        <w:ind w:left="6840" w:hanging="360"/>
+      </w:pPr>
+    </w:lvl>
+    <w:lvl w:ilvl="8" w:tplc="0409001B" w:tentative="1">
+      <w:start w:val="1"/>
+      <w:numFmt w:val="lowerRoman"/>
+      <w:lvlText w:val="%9."/>
+      <w:lvlJc w:val="right"/>
+      <w:pPr>
+        <w:ind w:left="7560" w:hanging="180"/>
+      </w:pPr>
+    </w:lvl>
+  </w:abstractNum>
   <w:num w:numId="1" w16cid:durableId="1216620011">
+    <w:abstractNumId w:val="3"/>
+  </w:num>
+  <w:num w:numId="2" w16cid:durableId="1805660942">
+    <w:abstractNumId w:val="1"/>
+  </w:num>
+  <w:num w:numId="3" w16cid:durableId="394933385">
     <w:abstractNumId w:val="2"/>
   </w:num>
-  <w:num w:numId="2" w16cid:durableId="1805660942">
+  <w:num w:numId="4" w16cid:durableId="1218778838">
     <w:abstractNumId w:val="0"/>
-  </w:num>
-  <w:num w:numId="3" w16cid:durableId="394933385">
-    <w:abstractNumId w:val="1"/>
   </w:num>
 </w:numbering>
 </file>

</xml_diff>